<commit_message>
Add e_cef_nplpj function for PDF data extraction and update extrajudicial notification template for clarity
</commit_message>
<xml_diff>
--- a/templates/Extrajudicial.docx
+++ b/templates/Extrajudicial.docx
@@ -446,7 +446,7 @@
     <w:tbl>
       <w:tblPr>
         <w:tblpPr w:leftFromText="141" w:rightFromText="141" w:vertAnchor="text" w:horzAnchor="margin" w:tblpXSpec="center" w:tblpY="381"/>
-        <w:tblW w:w="7520" w:type="dxa"/>
+        <w:tblW w:w="6016" w:type="dxa"/>
         <w:tblCellMar>
           <w:left w:w="70" w:type="dxa"/>
           <w:right w:w="70" w:type="dxa"/>
@@ -454,7 +454,6 @@
         <w:tblLook w:val="04A0" w:firstRow="1" w:lastRow="0" w:firstColumn="1" w:lastColumn="0" w:noHBand="0" w:noVBand="1"/>
       </w:tblPr>
       <w:tblGrid>
-        <w:gridCol w:w="1504"/>
         <w:gridCol w:w="1504"/>
         <w:gridCol w:w="1504"/>
         <w:gridCol w:w="1504"/>
@@ -506,6 +505,41 @@
             <w:tcBorders>
               <w:top w:val="single" w:sz="4" w:space="0" w:color="auto"/>
               <w:left w:val="nil"/>
+              <w:bottom w:val="single" w:sz="4" w:space="0" w:color="auto"/>
+              <w:right w:val="nil"/>
+            </w:tcBorders>
+            <w:vAlign w:val="center"/>
+          </w:tcPr>
+          <w:p>
+            <w:pPr>
+              <w:spacing w:after="0" w:line="240" w:lineRule="auto"/>
+              <w:jc w:val="center"/>
+              <w:rPr>
+                <w:rFonts w:ascii="Calibri" w:eastAsia="Times New Roman" w:hAnsi="Calibri" w:cs="Calibri"/>
+                <w:color w:val="000000"/>
+                <w:sz w:val="20"/>
+                <w:szCs w:val="20"/>
+                <w:lang w:eastAsia="pt-BR"/>
+              </w:rPr>
+            </w:pPr>
+            <w:r>
+              <w:rPr>
+                <w:rFonts w:ascii="Calibri" w:eastAsia="Times New Roman" w:hAnsi="Calibri" w:cs="Calibri"/>
+                <w:color w:val="000000"/>
+                <w:sz w:val="20"/>
+                <w:szCs w:val="20"/>
+                <w:lang w:eastAsia="pt-BR"/>
+              </w:rPr>
+              <w:t>ANO</w:t>
+            </w:r>
+          </w:p>
+        </w:tc>
+        <w:tc>
+          <w:tcPr>
+            <w:tcW w:w="1504" w:type="dxa"/>
+            <w:tcBorders>
+              <w:top w:val="single" w:sz="4" w:space="0" w:color="auto"/>
+              <w:left w:val="single" w:sz="4" w:space="0" w:color="auto"/>
               <w:bottom w:val="single" w:sz="4" w:space="0" w:color="auto"/>
               <w:right w:val="single" w:sz="4" w:space="0" w:color="auto"/>
             </w:tcBorders>
@@ -565,42 +599,6 @@
             <w:tcW w:w="1504" w:type="dxa"/>
             <w:tcBorders>
               <w:top w:val="single" w:sz="4" w:space="0" w:color="auto"/>
-              <w:left w:val="single" w:sz="4" w:space="0" w:color="auto"/>
-              <w:bottom w:val="single" w:sz="4" w:space="0" w:color="auto"/>
-              <w:right w:val="single" w:sz="4" w:space="0" w:color="auto"/>
-            </w:tcBorders>
-            <w:vAlign w:val="center"/>
-            <w:hideMark/>
-          </w:tcPr>
-          <w:p>
-            <w:pPr>
-              <w:spacing w:after="0" w:line="240" w:lineRule="auto"/>
-              <w:jc w:val="center"/>
-              <w:rPr>
-                <w:rFonts w:ascii="Calibri" w:eastAsia="Times New Roman" w:hAnsi="Calibri" w:cs="Calibri"/>
-                <w:color w:val="000000"/>
-                <w:sz w:val="20"/>
-                <w:szCs w:val="20"/>
-                <w:lang w:eastAsia="pt-BR"/>
-              </w:rPr>
-            </w:pPr>
-            <w:r>
-              <w:rPr>
-                <w:rFonts w:ascii="Calibri" w:eastAsia="Times New Roman" w:hAnsi="Calibri" w:cs="Calibri"/>
-                <w:color w:val="000000"/>
-                <w:sz w:val="20"/>
-                <w:szCs w:val="20"/>
-                <w:lang w:eastAsia="pt-BR"/>
-              </w:rPr>
-              <w:t>ANO</w:t>
-            </w:r>
-          </w:p>
-        </w:tc>
-        <w:tc>
-          <w:tcPr>
-            <w:tcW w:w="1504" w:type="dxa"/>
-            <w:tcBorders>
-              <w:top w:val="single" w:sz="4" w:space="0" w:color="auto"/>
               <w:left w:val="nil"/>
               <w:bottom w:val="single" w:sz="4" w:space="0" w:color="auto"/>
               <w:right w:val="single" w:sz="4" w:space="0" w:color="auto"/>
@@ -629,42 +627,6 @@
                 <w:lang w:eastAsia="pt-BR"/>
               </w:rPr>
               <w:t>VALOR PENDENTE</w:t>
-            </w:r>
-          </w:p>
-        </w:tc>
-        <w:tc>
-          <w:tcPr>
-            <w:tcW w:w="1504" w:type="dxa"/>
-            <w:tcBorders>
-              <w:top w:val="single" w:sz="4" w:space="0" w:color="auto"/>
-              <w:left w:val="nil"/>
-              <w:bottom w:val="single" w:sz="4" w:space="0" w:color="auto"/>
-              <w:right w:val="single" w:sz="4" w:space="0" w:color="auto"/>
-            </w:tcBorders>
-            <w:vAlign w:val="center"/>
-            <w:hideMark/>
-          </w:tcPr>
-          <w:p>
-            <w:pPr>
-              <w:spacing w:after="0" w:line="240" w:lineRule="auto"/>
-              <w:jc w:val="center"/>
-              <w:rPr>
-                <w:rFonts w:ascii="Calibri" w:eastAsia="Times New Roman" w:hAnsi="Calibri" w:cs="Calibri"/>
-                <w:color w:val="000000"/>
-                <w:sz w:val="20"/>
-                <w:szCs w:val="20"/>
-                <w:lang w:eastAsia="pt-BR"/>
-              </w:rPr>
-            </w:pPr>
-            <w:r>
-              <w:rPr>
-                <w:rFonts w:ascii="Calibri" w:eastAsia="Times New Roman" w:hAnsi="Calibri" w:cs="Calibri"/>
-                <w:color w:val="000000"/>
-                <w:sz w:val="20"/>
-                <w:szCs w:val="20"/>
-                <w:lang w:eastAsia="pt-BR"/>
-              </w:rPr>
-              <w:t>MONTANTE TOTAL DEVIDO</w:t>
             </w:r>
           </w:p>
         </w:tc>
@@ -699,7 +661,7 @@
               </w:rPr>
               <w:id w:val="410591001"/>
               <w:placeholder>
-                <w:docPart w:val="DefaultPlaceholder_-1854013435"/>
+                <w:docPart w:val="4BF3425ED613439193FF05D22F33C567"/>
               </w:placeholder>
               <w15:repeatingSectionItem/>
             </w:sdtPr>
@@ -748,7 +710,7 @@
                         <w:tag w:val="Mês"/>
                         <w:id w:val="-1172487062"/>
                         <w:placeholder>
-                          <w:docPart w:val="FEE9E46CE90E4E5DA7F5C61BEE5D3F53"/>
+                          <w:docPart w:val="43AF5212951947A59DB0B52A3BC0E9DD"/>
                         </w:placeholder>
                         <w:text/>
                       </w:sdtPr>
@@ -792,11 +754,11 @@
                       <w:szCs w:val="20"/>
                       <w:lang w:eastAsia="pt-BR"/>
                     </w:rPr>
-                    <w:alias w:val="Elemento"/>
-                    <w:tag w:val="Elemento"/>
-                    <w:id w:val="-2028013770"/>
+                    <w:alias w:val="Ano"/>
+                    <w:tag w:val="Ano"/>
+                    <w:id w:val="-1303224299"/>
                     <w:placeholder>
-                      <w:docPart w:val="DefaultPlaceholder_-1854013440"/>
+                      <w:docPart w:val="1B93C033F3944AE4918A385D15A4DCF7"/>
                     </w:placeholder>
                     <w:text/>
                   </w:sdtPr>
@@ -807,6 +769,67 @@
                         <w:tcBorders>
                           <w:top w:val="single" w:sz="4" w:space="0" w:color="auto"/>
                           <w:left w:val="nil"/>
+                          <w:bottom w:val="single" w:sz="4" w:space="0" w:color="auto"/>
+                          <w:right w:val="nil"/>
+                        </w:tcBorders>
+                        <w:vAlign w:val="center"/>
+                      </w:tcPr>
+                      <w:p>
+                        <w:pPr>
+                          <w:spacing w:after="0" w:line="240" w:lineRule="auto"/>
+                          <w:jc w:val="center"/>
+                          <w:rPr>
+                            <w:rFonts w:ascii="Calibri" w:eastAsia="Times New Roman" w:hAnsi="Calibri" w:cs="Calibri"/>
+                            <w:b/>
+                            <w:bCs/>
+                            <w:color w:val="EE0000"/>
+                            <w:sz w:val="20"/>
+                            <w:szCs w:val="20"/>
+                            <w:lang w:eastAsia="pt-BR"/>
+                          </w:rPr>
+                        </w:pPr>
+                        <w:r>
+                          <w:rPr>
+                            <w:rFonts w:ascii="Calibri" w:eastAsia="Times New Roman" w:hAnsi="Calibri" w:cs="Calibri"/>
+                            <w:b/>
+                            <w:bCs/>
+                            <w:color w:val="EE0000"/>
+                            <w:sz w:val="20"/>
+                            <w:szCs w:val="20"/>
+                            <w:lang w:eastAsia="pt-BR"/>
+                          </w:rPr>
+                          <w:t>Ano</w:t>
+                        </w:r>
+                      </w:p>
+                    </w:tc>
+                  </w:sdtContent>
+                </w:sdt>
+                <w:sdt>
+                  <w:sdtPr>
+                    <w:rPr>
+                      <w:rFonts w:ascii="Calibri" w:eastAsia="Times New Roman" w:hAnsi="Calibri" w:cs="Calibri"/>
+                      <w:b/>
+                      <w:bCs/>
+                      <w:color w:val="EE0000"/>
+                      <w:sz w:val="20"/>
+                      <w:szCs w:val="20"/>
+                      <w:lang w:eastAsia="pt-BR"/>
+                    </w:rPr>
+                    <w:alias w:val="Elemento"/>
+                    <w:tag w:val="Elemento"/>
+                    <w:id w:val="-2028013770"/>
+                    <w:placeholder>
+                      <w:docPart w:val="8F3CDA7C8A2645D2897C60DE38569DC2"/>
+                    </w:placeholder>
+                    <w:text/>
+                  </w:sdtPr>
+                  <w:sdtContent>
+                    <w:tc>
+                      <w:tcPr>
+                        <w:tcW w:w="1504" w:type="dxa"/>
+                        <w:tcBorders>
+                          <w:top w:val="single" w:sz="4" w:space="0" w:color="auto"/>
+                          <w:left w:val="single" w:sz="4" w:space="0" w:color="auto"/>
                           <w:bottom w:val="single" w:sz="4" w:space="0" w:color="auto"/>
                           <w:right w:val="single" w:sz="4" w:space="0" w:color="auto"/>
                         </w:tcBorders>
@@ -852,72 +875,11 @@
                       <w:szCs w:val="20"/>
                       <w:lang w:eastAsia="pt-BR"/>
                     </w:rPr>
-                    <w:alias w:val="Ano"/>
-                    <w:tag w:val="Ano"/>
-                    <w:id w:val="-1303224299"/>
-                    <w:placeholder>
-                      <w:docPart w:val="DefaultPlaceholder_-1854013440"/>
-                    </w:placeholder>
-                    <w:text/>
-                  </w:sdtPr>
-                  <w:sdtContent>
-                    <w:tc>
-                      <w:tcPr>
-                        <w:tcW w:w="1504" w:type="dxa"/>
-                        <w:tcBorders>
-                          <w:top w:val="single" w:sz="4" w:space="0" w:color="auto"/>
-                          <w:left w:val="single" w:sz="4" w:space="0" w:color="auto"/>
-                          <w:bottom w:val="single" w:sz="4" w:space="0" w:color="auto"/>
-                          <w:right w:val="single" w:sz="4" w:space="0" w:color="auto"/>
-                        </w:tcBorders>
-                        <w:vAlign w:val="center"/>
-                      </w:tcPr>
-                      <w:p>
-                        <w:pPr>
-                          <w:spacing w:after="0" w:line="240" w:lineRule="auto"/>
-                          <w:jc w:val="center"/>
-                          <w:rPr>
-                            <w:rFonts w:ascii="Calibri" w:eastAsia="Times New Roman" w:hAnsi="Calibri" w:cs="Calibri"/>
-                            <w:b/>
-                            <w:bCs/>
-                            <w:color w:val="EE0000"/>
-                            <w:sz w:val="20"/>
-                            <w:szCs w:val="20"/>
-                            <w:lang w:eastAsia="pt-BR"/>
-                          </w:rPr>
-                        </w:pPr>
-                        <w:r>
-                          <w:rPr>
-                            <w:rFonts w:ascii="Calibri" w:eastAsia="Times New Roman" w:hAnsi="Calibri" w:cs="Calibri"/>
-                            <w:b/>
-                            <w:bCs/>
-                            <w:color w:val="EE0000"/>
-                            <w:sz w:val="20"/>
-                            <w:szCs w:val="20"/>
-                            <w:lang w:eastAsia="pt-BR"/>
-                          </w:rPr>
-                          <w:t>Ano</w:t>
-                        </w:r>
-                      </w:p>
-                    </w:tc>
-                  </w:sdtContent>
-                </w:sdt>
-                <w:sdt>
-                  <w:sdtPr>
-                    <w:rPr>
-                      <w:rFonts w:ascii="Calibri" w:eastAsia="Times New Roman" w:hAnsi="Calibri" w:cs="Calibri"/>
-                      <w:b/>
-                      <w:bCs/>
-                      <w:color w:val="EE0000"/>
-                      <w:sz w:val="20"/>
-                      <w:szCs w:val="20"/>
-                      <w:lang w:eastAsia="pt-BR"/>
-                    </w:rPr>
                     <w:alias w:val="Valor pendente"/>
                     <w:tag w:val="Valor pendente"/>
                     <w:id w:val="-162242550"/>
                     <w:placeholder>
-                      <w:docPart w:val="DefaultPlaceholder_-1854013440"/>
+                      <w:docPart w:val="8F3CDA7C8A2645D2897C60DE38569DC2"/>
                     </w:placeholder>
                     <w:text/>
                   </w:sdtPr>
@@ -963,67 +925,6 @@
                     </w:tc>
                   </w:sdtContent>
                 </w:sdt>
-                <w:sdt>
-                  <w:sdtPr>
-                    <w:rPr>
-                      <w:rFonts w:ascii="Calibri" w:eastAsia="Times New Roman" w:hAnsi="Calibri" w:cs="Calibri"/>
-                      <w:b/>
-                      <w:bCs/>
-                      <w:color w:val="EE0000"/>
-                      <w:sz w:val="20"/>
-                      <w:szCs w:val="20"/>
-                      <w:lang w:eastAsia="pt-BR"/>
-                    </w:rPr>
-                    <w:alias w:val="Montante total devido"/>
-                    <w:tag w:val="Montante total devido"/>
-                    <w:id w:val="1142155888"/>
-                    <w:placeholder>
-                      <w:docPart w:val="DefaultPlaceholder_-1854013440"/>
-                    </w:placeholder>
-                    <w:text/>
-                  </w:sdtPr>
-                  <w:sdtContent>
-                    <w:tc>
-                      <w:tcPr>
-                        <w:tcW w:w="1504" w:type="dxa"/>
-                        <w:tcBorders>
-                          <w:top w:val="single" w:sz="4" w:space="0" w:color="auto"/>
-                          <w:left w:val="nil"/>
-                          <w:bottom w:val="single" w:sz="4" w:space="0" w:color="auto"/>
-                          <w:right w:val="single" w:sz="4" w:space="0" w:color="auto"/>
-                        </w:tcBorders>
-                        <w:vAlign w:val="center"/>
-                      </w:tcPr>
-                      <w:p>
-                        <w:pPr>
-                          <w:spacing w:after="0" w:line="240" w:lineRule="auto"/>
-                          <w:jc w:val="center"/>
-                          <w:rPr>
-                            <w:rFonts w:ascii="Calibri" w:eastAsia="Times New Roman" w:hAnsi="Calibri" w:cs="Calibri"/>
-                            <w:b/>
-                            <w:bCs/>
-                            <w:color w:val="EE0000"/>
-                            <w:sz w:val="20"/>
-                            <w:szCs w:val="20"/>
-                            <w:lang w:eastAsia="pt-BR"/>
-                          </w:rPr>
-                        </w:pPr>
-                        <w:r>
-                          <w:rPr>
-                            <w:rFonts w:ascii="Calibri" w:eastAsia="Times New Roman" w:hAnsi="Calibri" w:cs="Calibri"/>
-                            <w:b/>
-                            <w:bCs/>
-                            <w:color w:val="EE0000"/>
-                            <w:sz w:val="20"/>
-                            <w:szCs w:val="20"/>
-                            <w:lang w:eastAsia="pt-BR"/>
-                          </w:rPr>
-                          <w:t>Montante total devido</w:t>
-                        </w:r>
-                      </w:p>
-                    </w:tc>
-                  </w:sdtContent>
-                </w:sdt>
               </w:tr>
             </w:sdtContent>
           </w:sdt>
@@ -1044,6 +945,16 @@
       <w:pPr>
         <w:jc w:val="both"/>
       </w:pPr>
+    </w:p>
+    <w:p>
+      <w:pPr>
+        <w:jc w:val="both"/>
+      </w:pPr>
+    </w:p>
+    <w:p>
+      <w:pPr>
+        <w:jc w:val="both"/>
+      </w:pPr>
       <w:r>
         <w:t>Conforme tabela acima, a NOTIFICADA tem um débito</w:t>
       </w:r>
@@ -1068,8 +979,8 @@
             <w:color w:val="EE0000"/>
             <w:lang w:eastAsia="pt-BR"/>
           </w:rPr>
-          <w:alias w:val="Valor do débito"/>
-          <w:tag w:val="Valor do débito"/>
+          <w:alias w:val="Montante total devido"/>
+          <w:tag w:val="Montante total devido"/>
           <w:id w:val="-1377386850"/>
           <w:placeholder>
             <w:docPart w:val="DefaultPlaceholder_-1854013440"/>
@@ -1085,7 +996,7 @@
               <w:color w:val="EE0000"/>
               <w:lang w:eastAsia="pt-BR"/>
             </w:rPr>
-            <w:t>Valor do débito</w:t>
+            <w:t>Montante total devido</w:t>
           </w:r>
         </w:sdtContent>
       </w:sdt>
@@ -1183,7 +1094,15 @@
         <w:jc w:val="both"/>
       </w:pPr>
       <w:r>
-        <w:t>*Obs: Caso o referido débito já tenha sido quitado ao tempo d</w:t>
+        <w:t>*</w:t>
+      </w:r>
+      <w:proofErr w:type="spellStart"/>
+      <w:r>
+        <w:t>Obs</w:t>
+      </w:r>
+      <w:proofErr w:type="spellEnd"/>
+      <w:r>
+        <w:t>: Caso o referido débito já tenha sido quitado ao tempo d</w:t>
       </w:r>
       <w:r>
         <w:t>o</w:t>
@@ -1224,8 +1143,13 @@
         <w:t xml:space="preserve">Dr. </w:t>
       </w:r>
       <w:r>
-        <w:t>Giuseppe Carapello</w:t>
-      </w:r>
+        <w:t xml:space="preserve">Giuseppe </w:t>
+      </w:r>
+      <w:proofErr w:type="spellStart"/>
+      <w:r>
+        <w:t>Carapello</w:t>
+      </w:r>
+      <w:proofErr w:type="spellEnd"/>
     </w:p>
     <w:p>
       <w:pPr>
@@ -1243,34 +1167,8 @@
         <w:t xml:space="preserve"> empresa</w:t>
       </w:r>
       <w:r>
-        <w:t xml:space="preserve"> </w:t>
-      </w:r>
-      <w:sdt>
-        <w:sdtPr>
-          <w:rPr>
-            <w:b/>
-            <w:bCs/>
-            <w:color w:val="EE0000"/>
-          </w:rPr>
-          <w:alias w:val="Responsável jurídico da Ampla"/>
-          <w:tag w:val="Responsável jurídico da Ampla"/>
-          <w:id w:val="-549373390"/>
-          <w:placeholder>
-            <w:docPart w:val="DefaultPlaceholder_-1854013440"/>
-          </w:placeholder>
-          <w:text/>
-        </w:sdtPr>
-        <w:sdtContent>
-          <w:r>
-            <w:rPr>
-              <w:b/>
-              <w:bCs/>
-              <w:color w:val="EE0000"/>
-            </w:rPr>
-            <w:t>Responsável jurídico da Ampla</w:t>
-          </w:r>
-        </w:sdtContent>
-      </w:sdt>
+        <w:t xml:space="preserve"> NOTIFICANTE</w:t>
+      </w:r>
     </w:p>
     <w:p>
       <w:pPr>
@@ -1945,7 +1843,7 @@
     </w:docPart>
     <w:docPart>
       <w:docPartPr>
-        <w:name w:val="DefaultPlaceholder_-1854013435"/>
+        <w:name w:val="4BF3425ED613439193FF05D22F33C567"/>
         <w:category>
           <w:name w:val="Geral"/>
           <w:gallery w:val="placeholder"/>
@@ -1956,10 +1854,13 @@
         <w:behaviors>
           <w:behavior w:val="content"/>
         </w:behaviors>
-        <w:guid w:val="{9CA7FC38-CC7C-4F5E-BFD7-1A2BF10D111D}"/>
+        <w:guid w:val="{D38F985A-21CC-43F4-9087-7D1373B1C228}"/>
       </w:docPartPr>
       <w:docPartBody>
         <w:p>
+          <w:pPr>
+            <w:pStyle w:val="4BF3425ED613439193FF05D22F33C567"/>
+          </w:pPr>
           <w:r>
             <w:rPr>
               <w:rStyle w:val="TextodoEspaoReservado"/>
@@ -1971,7 +1872,7 @@
     </w:docPart>
     <w:docPart>
       <w:docPartPr>
-        <w:name w:val="FEE9E46CE90E4E5DA7F5C61BEE5D3F53"/>
+        <w:name w:val="43AF5212951947A59DB0B52A3BC0E9DD"/>
         <w:category>
           <w:name w:val="Geral"/>
           <w:gallery w:val="placeholder"/>
@@ -1982,12 +1883,70 @@
         <w:behaviors>
           <w:behavior w:val="content"/>
         </w:behaviors>
-        <w:guid w:val="{7781E3DD-F867-4E66-BDF6-3341E306E3EA}"/>
+        <w:guid w:val="{109A30F3-E0D8-4F98-B457-2C85F3089C65}"/>
       </w:docPartPr>
       <w:docPartBody>
         <w:p>
           <w:pPr>
-            <w:pStyle w:val="FEE9E46CE90E4E5DA7F5C61BEE5D3F53"/>
+            <w:pStyle w:val="43AF5212951947A59DB0B52A3BC0E9DD"/>
+          </w:pPr>
+          <w:r>
+            <w:rPr>
+              <w:rStyle w:val="TextodoEspaoReservado"/>
+            </w:rPr>
+            <w:t>Clique ou toque aqui para inserir o texto.</w:t>
+          </w:r>
+        </w:p>
+      </w:docPartBody>
+    </w:docPart>
+    <w:docPart>
+      <w:docPartPr>
+        <w:name w:val="1B93C033F3944AE4918A385D15A4DCF7"/>
+        <w:category>
+          <w:name w:val="Geral"/>
+          <w:gallery w:val="placeholder"/>
+        </w:category>
+        <w:types>
+          <w:type w:val="bbPlcHdr"/>
+        </w:types>
+        <w:behaviors>
+          <w:behavior w:val="content"/>
+        </w:behaviors>
+        <w:guid w:val="{DFC5818E-19E0-41F9-82F9-AD29DEA41D6F}"/>
+      </w:docPartPr>
+      <w:docPartBody>
+        <w:p>
+          <w:pPr>
+            <w:pStyle w:val="1B93C033F3944AE4918A385D15A4DCF7"/>
+          </w:pPr>
+          <w:r>
+            <w:rPr>
+              <w:rStyle w:val="TextodoEspaoReservado"/>
+            </w:rPr>
+            <w:t>Clique ou toque aqui para inserir o texto.</w:t>
+          </w:r>
+        </w:p>
+      </w:docPartBody>
+    </w:docPart>
+    <w:docPart>
+      <w:docPartPr>
+        <w:name w:val="8F3CDA7C8A2645D2897C60DE38569DC2"/>
+        <w:category>
+          <w:name w:val="Geral"/>
+          <w:gallery w:val="placeholder"/>
+        </w:category>
+        <w:types>
+          <w:type w:val="bbPlcHdr"/>
+        </w:types>
+        <w:behaviors>
+          <w:behavior w:val="content"/>
+        </w:behaviors>
+        <w:guid w:val="{CD17D963-3241-4316-A781-B3226D1E3624}"/>
+      </w:docPartPr>
+      <w:docPartBody>
+        <w:p>
+          <w:pPr>
+            <w:pStyle w:val="8F3CDA7C8A2645D2897C60DE38569DC2"/>
           </w:pPr>
           <w:r>
             <w:rPr>
@@ -2059,8 +2018,11 @@
     <w:rsidRoot w:val="004404EE"/>
     <w:rsid w:val="000571E1"/>
     <w:rsid w:val="0008618A"/>
+    <w:rsid w:val="000A208B"/>
     <w:rsid w:val="000A5149"/>
     <w:rsid w:val="001704CA"/>
+    <w:rsid w:val="001D759B"/>
+    <w:rsid w:val="00212990"/>
     <w:rsid w:val="002C6DD6"/>
     <w:rsid w:val="00335F43"/>
     <w:rsid w:val="00402D11"/>
@@ -2527,26 +2489,146 @@
     <w:basedOn w:val="Fontepargpadro"/>
     <w:uiPriority w:val="99"/>
     <w:semiHidden/>
-    <w:rsid w:val="00E32C83"/>
+    <w:rsid w:val="000A208B"/>
     <w:rPr>
       <w:color w:val="666666"/>
     </w:rPr>
   </w:style>
-  <w:style w:type="paragraph" w:customStyle="1" w:styleId="031B6C1B972849B088DE1B68CE2AD0BB">
-    <w:name w:val="031B6C1B972849B088DE1B68CE2AD0BB"/>
-    <w:rsid w:val="00E32C83"/>
+  <w:style w:type="paragraph" w:customStyle="1" w:styleId="0FDBFE476FEC43A1960A09DC4A7E4785">
+    <w:name w:val="0FDBFE476FEC43A1960A09DC4A7E4785"/>
+    <w:rsid w:val="000A208B"/>
   </w:style>
   <w:style w:type="paragraph" w:customStyle="1" w:styleId="FEE9E46CE90E4E5DA7F5C61BEE5D3F53">
     <w:name w:val="FEE9E46CE90E4E5DA7F5C61BEE5D3F53"/>
     <w:rsid w:val="00E32C83"/>
   </w:style>
-  <w:style w:type="paragraph" w:customStyle="1" w:styleId="CE4365F4B558418298283209A711741B">
-    <w:name w:val="CE4365F4B558418298283209A711741B"/>
-    <w:rsid w:val="00E32C83"/>
-  </w:style>
-  <w:style w:type="paragraph" w:customStyle="1" w:styleId="3C8B15A3A21B41AC9B124BF9760062D8">
-    <w:name w:val="3C8B15A3A21B41AC9B124BF9760062D8"/>
-    <w:rsid w:val="00E32C83"/>
+  <w:style w:type="paragraph" w:customStyle="1" w:styleId="74A3CC1B4F2D4D01B6EDD18F5CFE59B7">
+    <w:name w:val="74A3CC1B4F2D4D01B6EDD18F5CFE59B7"/>
+    <w:rsid w:val="000A208B"/>
+  </w:style>
+  <w:style w:type="paragraph" w:customStyle="1" w:styleId="3559E91F76C64D608C205146FD460342">
+    <w:name w:val="3559E91F76C64D608C205146FD460342"/>
+    <w:rsid w:val="000A208B"/>
+  </w:style>
+  <w:style w:type="paragraph" w:customStyle="1" w:styleId="0806794ED44A478B9196D4A6303CB572">
+    <w:name w:val="0806794ED44A478B9196D4A6303CB572"/>
+    <w:rsid w:val="000A208B"/>
+  </w:style>
+  <w:style w:type="paragraph" w:customStyle="1" w:styleId="0FD0F102752647A5B68BFC0D8636ED3F">
+    <w:name w:val="0FD0F102752647A5B68BFC0D8636ED3F"/>
+    <w:rsid w:val="000A208B"/>
+  </w:style>
+  <w:style w:type="paragraph" w:customStyle="1" w:styleId="9D9A42CDA08E4CFA96386DC327478ABC">
+    <w:name w:val="9D9A42CDA08E4CFA96386DC327478ABC"/>
+    <w:rsid w:val="000A208B"/>
+  </w:style>
+  <w:style w:type="paragraph" w:customStyle="1" w:styleId="049208E81C79448E85DC983579325C66">
+    <w:name w:val="049208E81C79448E85DC983579325C66"/>
+    <w:rsid w:val="000A208B"/>
+  </w:style>
+  <w:style w:type="paragraph" w:customStyle="1" w:styleId="CF9C4550D925429E8AE089FC971D93BB">
+    <w:name w:val="CF9C4550D925429E8AE089FC971D93BB"/>
+    <w:rsid w:val="000A208B"/>
+  </w:style>
+  <w:style w:type="paragraph" w:customStyle="1" w:styleId="0304B7848A0944DF8070289BABDD32C2">
+    <w:name w:val="0304B7848A0944DF8070289BABDD32C2"/>
+    <w:rsid w:val="000A208B"/>
+  </w:style>
+  <w:style w:type="paragraph" w:customStyle="1" w:styleId="9C8B8F7CE275432FBBD05E6A2B66FA09">
+    <w:name w:val="9C8B8F7CE275432FBBD05E6A2B66FA09"/>
+    <w:rsid w:val="000A208B"/>
+  </w:style>
+  <w:style w:type="paragraph" w:customStyle="1" w:styleId="C9EE43A3E70C4DA6942F2B0382DCB4FF">
+    <w:name w:val="C9EE43A3E70C4DA6942F2B0382DCB4FF"/>
+    <w:rsid w:val="000A208B"/>
+  </w:style>
+  <w:style w:type="paragraph" w:customStyle="1" w:styleId="C32C4FD07ADC474DAF18EBD34BB6CA61">
+    <w:name w:val="C32C4FD07ADC474DAF18EBD34BB6CA61"/>
+    <w:rsid w:val="000A208B"/>
+  </w:style>
+  <w:style w:type="paragraph" w:customStyle="1" w:styleId="8530CD87215E47329A2BF67E60A5213A">
+    <w:name w:val="8530CD87215E47329A2BF67E60A5213A"/>
+    <w:rsid w:val="000A208B"/>
+  </w:style>
+  <w:style w:type="paragraph" w:customStyle="1" w:styleId="8BD03BA3EA9D4BD9BFE0E7E4EDA24D7E">
+    <w:name w:val="8BD03BA3EA9D4BD9BFE0E7E4EDA24D7E"/>
+    <w:rsid w:val="000A208B"/>
+  </w:style>
+  <w:style w:type="paragraph" w:customStyle="1" w:styleId="4EE358C7ED1A4600A1ECDB15666458A4">
+    <w:name w:val="4EE358C7ED1A4600A1ECDB15666458A4"/>
+    <w:rsid w:val="000A208B"/>
+  </w:style>
+  <w:style w:type="paragraph" w:customStyle="1" w:styleId="9BD24A52F6B747C583255EF7B43A2F16">
+    <w:name w:val="9BD24A52F6B747C583255EF7B43A2F16"/>
+    <w:rsid w:val="000A208B"/>
+  </w:style>
+  <w:style w:type="paragraph" w:customStyle="1" w:styleId="11E563BE6A584D06AF2EAD875096C1DD">
+    <w:name w:val="11E563BE6A584D06AF2EAD875096C1DD"/>
+    <w:rsid w:val="000A208B"/>
+  </w:style>
+  <w:style w:type="paragraph" w:customStyle="1" w:styleId="54727A3A36D2465AB69381D5ACAFCB9E">
+    <w:name w:val="54727A3A36D2465AB69381D5ACAFCB9E"/>
+    <w:rsid w:val="000A208B"/>
+  </w:style>
+  <w:style w:type="paragraph" w:customStyle="1" w:styleId="FCEA8C3FFA25462EB2F81EFAF21283F0">
+    <w:name w:val="FCEA8C3FFA25462EB2F81EFAF21283F0"/>
+    <w:rsid w:val="000A208B"/>
+  </w:style>
+  <w:style w:type="paragraph" w:customStyle="1" w:styleId="7A4FF1F961F14B5C8D7D13D154391AB1">
+    <w:name w:val="7A4FF1F961F14B5C8D7D13D154391AB1"/>
+    <w:rsid w:val="000A208B"/>
+  </w:style>
+  <w:style w:type="paragraph" w:customStyle="1" w:styleId="D4A69B82379448428B2CDB6004B35241">
+    <w:name w:val="D4A69B82379448428B2CDB6004B35241"/>
+    <w:rsid w:val="000A208B"/>
+  </w:style>
+  <w:style w:type="paragraph" w:customStyle="1" w:styleId="1CE20FCACF0640D295CD9BD04BE8B077">
+    <w:name w:val="1CE20FCACF0640D295CD9BD04BE8B077"/>
+    <w:rsid w:val="000A208B"/>
+  </w:style>
+  <w:style w:type="paragraph" w:customStyle="1" w:styleId="1AF155DB3EB448559E23D8A66A7E6AE6">
+    <w:name w:val="1AF155DB3EB448559E23D8A66A7E6AE6"/>
+    <w:rsid w:val="000A208B"/>
+  </w:style>
+  <w:style w:type="paragraph" w:customStyle="1" w:styleId="1C97C55A172D46ACB45EA1EA919E2009">
+    <w:name w:val="1C97C55A172D46ACB45EA1EA919E2009"/>
+    <w:rsid w:val="000A208B"/>
+  </w:style>
+  <w:style w:type="paragraph" w:customStyle="1" w:styleId="99A738BC995446C6AFD58C8D0DED6F4C">
+    <w:name w:val="99A738BC995446C6AFD58C8D0DED6F4C"/>
+    <w:rsid w:val="000A208B"/>
+  </w:style>
+  <w:style w:type="paragraph" w:customStyle="1" w:styleId="B1729E197DFB4CF1BF298CD73A32F47A">
+    <w:name w:val="B1729E197DFB4CF1BF298CD73A32F47A"/>
+    <w:rsid w:val="000A208B"/>
+  </w:style>
+  <w:style w:type="paragraph" w:customStyle="1" w:styleId="6012473721DF467ABE85D27FB52E8F3E">
+    <w:name w:val="6012473721DF467ABE85D27FB52E8F3E"/>
+    <w:rsid w:val="000A208B"/>
+  </w:style>
+  <w:style w:type="paragraph" w:customStyle="1" w:styleId="EAEE94A4728B4031881052DF232FBBA4">
+    <w:name w:val="EAEE94A4728B4031881052DF232FBBA4"/>
+    <w:rsid w:val="000A208B"/>
+  </w:style>
+  <w:style w:type="paragraph" w:customStyle="1" w:styleId="1C437D2C6EA540D1B2A4E9AB21339A17">
+    <w:name w:val="1C437D2C6EA540D1B2A4E9AB21339A17"/>
+    <w:rsid w:val="000A208B"/>
+  </w:style>
+  <w:style w:type="paragraph" w:customStyle="1" w:styleId="4BF3425ED613439193FF05D22F33C567">
+    <w:name w:val="4BF3425ED613439193FF05D22F33C567"/>
+    <w:rsid w:val="000A208B"/>
+  </w:style>
+  <w:style w:type="paragraph" w:customStyle="1" w:styleId="43AF5212951947A59DB0B52A3BC0E9DD">
+    <w:name w:val="43AF5212951947A59DB0B52A3BC0E9DD"/>
+    <w:rsid w:val="000A208B"/>
+  </w:style>
+  <w:style w:type="paragraph" w:customStyle="1" w:styleId="1B93C033F3944AE4918A385D15A4DCF7">
+    <w:name w:val="1B93C033F3944AE4918A385D15A4DCF7"/>
+    <w:rsid w:val="000A208B"/>
+  </w:style>
+  <w:style w:type="paragraph" w:customStyle="1" w:styleId="8F3CDA7C8A2645D2897C60DE38569DC2">
+    <w:name w:val="8F3CDA7C8A2645D2897C60DE38569DC2"/>
+    <w:rsid w:val="000A208B"/>
   </w:style>
 </w:styles>
 </file>
@@ -2863,6 +2945,17 @@
 </file>
 
 <file path=customXml/item2.xml><?xml version="1.0" encoding="utf-8"?>
+<p:properties xmlns:p="http://schemas.microsoft.com/office/2006/metadata/properties" xmlns:xsi="http://www.w3.org/2001/XMLSchema-instance" xmlns:pc="http://schemas.microsoft.com/office/infopath/2007/PartnerControls">
+  <documentManagement>
+    <TaxCatchAll xmlns="dd8c73df-45bd-468c-aae5-f3faedcbd5e2" xsi:nil="true"/>
+    <lcf76f155ced4ddcb4097134ff3c332f xmlns="5a5f483f-f768-438e-b4ef-63f46a7558dd">
+      <Terms xmlns="http://schemas.microsoft.com/office/infopath/2007/PartnerControls"/>
+    </lcf76f155ced4ddcb4097134ff3c332f>
+  </documentManagement>
+</p:properties>
+</file>
+
+<file path=customXml/item3.xml><?xml version="1.0" encoding="utf-8"?>
 <ct:contentTypeSchema xmlns:ct="http://schemas.microsoft.com/office/2006/metadata/contentType" xmlns:ma="http://schemas.microsoft.com/office/2006/metadata/properties/metaAttributes" ct:_="" ma:_="" ma:contentTypeName="Documento" ma:contentTypeID="0x0101006C56FB2846673243A9735D5EC6051572" ma:contentTypeVersion="11" ma:contentTypeDescription="Crie um novo documento." ma:contentTypeScope="" ma:versionID="36569ac63cfce8ff0f8884bc80e67f1c">
   <xsd:schema xmlns:xsd="http://www.w3.org/2001/XMLSchema" xmlns:xs="http://www.w3.org/2001/XMLSchema" xmlns:p="http://schemas.microsoft.com/office/2006/metadata/properties" xmlns:ns2="5a5f483f-f768-438e-b4ef-63f46a7558dd" xmlns:ns3="dd8c73df-45bd-468c-aae5-f3faedcbd5e2" targetNamespace="http://schemas.microsoft.com/office/2006/metadata/properties" ma:root="true" ma:fieldsID="2040da04b75a9ea4fe796fa8180f8ca6" ns2:_="" ns3:_="">
     <xsd:import namespace="5a5f483f-f768-438e-b4ef-63f46a7558dd"/>
@@ -3057,17 +3150,6 @@
 </ct:contentTypeSchema>
 </file>
 
-<file path=customXml/item3.xml><?xml version="1.0" encoding="utf-8"?>
-<p:properties xmlns:p="http://schemas.microsoft.com/office/2006/metadata/properties" xmlns:xsi="http://www.w3.org/2001/XMLSchema-instance" xmlns:pc="http://schemas.microsoft.com/office/infopath/2007/PartnerControls">
-  <documentManagement>
-    <TaxCatchAll xmlns="dd8c73df-45bd-468c-aae5-f3faedcbd5e2" xsi:nil="true"/>
-    <lcf76f155ced4ddcb4097134ff3c332f xmlns="5a5f483f-f768-438e-b4ef-63f46a7558dd">
-      <Terms xmlns="http://schemas.microsoft.com/office/infopath/2007/PartnerControls"/>
-    </lcf76f155ced4ddcb4097134ff3c332f>
-  </documentManagement>
-</p:properties>
-</file>
-
 <file path=customXml/itemProps1.xml><?xml version="1.0" encoding="utf-8"?>
 <ds:datastoreItem xmlns:ds="http://schemas.openxmlformats.org/officeDocument/2006/customXml" ds:itemID="{58EDEAD3-6007-4390-96FF-D5B7A3E11101}">
   <ds:schemaRefs>
@@ -3077,6 +3159,17 @@
 </file>
 
 <file path=customXml/itemProps2.xml><?xml version="1.0" encoding="utf-8"?>
+<ds:datastoreItem xmlns:ds="http://schemas.openxmlformats.org/officeDocument/2006/customXml" ds:itemID="{33CB333C-BB54-4ECA-899C-4EFF446F4EC1}">
+  <ds:schemaRefs>
+    <ds:schemaRef ds:uri="http://schemas.microsoft.com/office/2006/metadata/properties"/>
+    <ds:schemaRef ds:uri="http://schemas.microsoft.com/office/infopath/2007/PartnerControls"/>
+    <ds:schemaRef ds:uri="dd8c73df-45bd-468c-aae5-f3faedcbd5e2"/>
+    <ds:schemaRef ds:uri="5a5f483f-f768-438e-b4ef-63f46a7558dd"/>
+  </ds:schemaRefs>
+</ds:datastoreItem>
+</file>
+
+<file path=customXml/itemProps3.xml><?xml version="1.0" encoding="utf-8"?>
 <ds:datastoreItem xmlns:ds="http://schemas.openxmlformats.org/officeDocument/2006/customXml" ds:itemID="{89836813-FDBA-4754-AE59-95D2199AA1C7}">
   <ds:schemaRefs>
     <ds:schemaRef ds:uri="http://schemas.microsoft.com/office/2006/metadata/contentType"/>
@@ -3093,15 +3186,4 @@
     <ds:schemaRef ds:uri="http://schemas.microsoft.com/internal/obd"/>
   </ds:schemaRefs>
 </ds:datastoreItem>
-</file>
-
-<file path=customXml/itemProps3.xml><?xml version="1.0" encoding="utf-8"?>
-<ds:datastoreItem xmlns:ds="http://schemas.openxmlformats.org/officeDocument/2006/customXml" ds:itemID="{33CB333C-BB54-4ECA-899C-4EFF446F4EC1}">
-  <ds:schemaRefs>
-    <ds:schemaRef ds:uri="http://schemas.microsoft.com/office/2006/metadata/properties"/>
-    <ds:schemaRef ds:uri="http://schemas.microsoft.com/office/infopath/2007/PartnerControls"/>
-    <ds:schemaRef ds:uri="dd8c73df-45bd-468c-aae5-f3faedcbd5e2"/>
-    <ds:schemaRef ds:uri="5a5f483f-f768-438e-b4ef-63f46a7558dd"/>
-  </ds:schemaRefs>
-</ds:datastoreItem>
 </file>
</xml_diff>

<commit_message>
Enhance e_cef_nplpj function to extract last two contract numbers and update e_cef_xcefs to utilize these contracts for filtering. Refactor e_ita_xitas to exclude specific descriptions from results. Update extrajudicial notification template for clarity.
</commit_message>
<xml_diff>
--- a/templates/Extrajudicial.docx
+++ b/templates/Extrajudicial.docx
@@ -30,9 +30,7 @@
     <w:sdt>
       <w:sdtPr>
         <w:rPr>
-          <w:b/>
-          <w:bCs/>
-          <w:color w:val="EE0000"/>
+          <w:color w:val="000000" w:themeColor="text1"/>
         </w:rPr>
         <w:alias w:val="Data da notificação"/>
         <w:tag w:val="Data da notificação"/>
@@ -47,24 +45,18 @@
           <w:pPr>
             <w:jc w:val="right"/>
             <w:rPr>
-              <w:b/>
-              <w:bCs/>
-              <w:color w:val="EE0000"/>
+              <w:color w:val="000000" w:themeColor="text1"/>
             </w:rPr>
           </w:pPr>
           <w:r>
             <w:rPr>
-              <w:b/>
-              <w:bCs/>
-              <w:color w:val="EE0000"/>
+              <w:color w:val="000000" w:themeColor="text1"/>
             </w:rPr>
             <w:t xml:space="preserve">Data da </w:t>
           </w:r>
           <w:r>
             <w:rPr>
-              <w:b/>
-              <w:bCs/>
-              <w:color w:val="EE0000"/>
+              <w:color w:val="000000" w:themeColor="text1"/>
             </w:rPr>
             <w:t>notificação</w:t>
           </w:r>
@@ -101,9 +93,7 @@
       <w:sdt>
         <w:sdtPr>
           <w:rPr>
-            <w:b/>
-            <w:bCs/>
-            <w:color w:val="EE0000"/>
+            <w:color w:val="000000" w:themeColor="text1"/>
           </w:rPr>
           <w:alias w:val="Notificante"/>
           <w:tag w:val="Notificante"/>
@@ -116,9 +106,7 @@
         <w:sdtContent>
           <w:r>
             <w:rPr>
-              <w:b/>
-              <w:bCs/>
-              <w:color w:val="EE0000"/>
+              <w:color w:val="000000" w:themeColor="text1"/>
             </w:rPr>
             <w:t>Notificante</w:t>
           </w:r>
@@ -146,9 +134,7 @@
       <w:sdt>
         <w:sdtPr>
           <w:rPr>
-            <w:b/>
-            <w:bCs/>
-            <w:color w:val="EE0000"/>
+            <w:color w:val="000000" w:themeColor="text1"/>
           </w:rPr>
           <w:alias w:val="Notificada"/>
           <w:tag w:val="Notificada"/>
@@ -161,9 +147,7 @@
         <w:sdtContent>
           <w:r>
             <w:rPr>
-              <w:b/>
-              <w:bCs/>
-              <w:color w:val="EE0000"/>
+              <w:color w:val="000000" w:themeColor="text1"/>
             </w:rPr>
             <w:t>Notificada</w:t>
           </w:r>
@@ -220,9 +204,7 @@
       <w:sdt>
         <w:sdtPr>
           <w:rPr>
-            <w:b/>
-            <w:bCs/>
-            <w:color w:val="EE0000"/>
+            <w:color w:val="000000" w:themeColor="text1"/>
           </w:rPr>
           <w:alias w:val="Data da assinatura"/>
           <w:tag w:val="Data da assinatura"/>
@@ -235,9 +217,7 @@
         <w:sdtContent>
           <w:r>
             <w:rPr>
-              <w:b/>
-              <w:bCs/>
-              <w:color w:val="EE0000"/>
+              <w:color w:val="000000" w:themeColor="text1"/>
             </w:rPr>
             <w:t>Data da assinatura</w:t>
           </w:r>
@@ -277,9 +257,7 @@
       <w:sdt>
         <w:sdtPr>
           <w:rPr>
-            <w:b/>
-            <w:bCs/>
-            <w:color w:val="EE0000"/>
+            <w:color w:val="000000" w:themeColor="text1"/>
           </w:rPr>
           <w:alias w:val="Unidade"/>
           <w:tag w:val="Unidde"/>
@@ -292,9 +270,7 @@
         <w:sdtContent>
           <w:r>
             <w:rPr>
-              <w:b/>
-              <w:bCs/>
-              <w:color w:val="EE0000"/>
+              <w:color w:val="000000" w:themeColor="text1"/>
             </w:rPr>
             <w:t>Unidade</w:t>
           </w:r>
@@ -309,9 +285,7 @@
       <w:sdt>
         <w:sdtPr>
           <w:rPr>
-            <w:b/>
-            <w:bCs/>
-            <w:color w:val="EE0000"/>
+            <w:color w:val="000000" w:themeColor="text1"/>
           </w:rPr>
           <w:alias w:val="Empreendimento"/>
           <w:tag w:val="Empreendimento"/>
@@ -324,9 +298,7 @@
         <w:sdtContent>
           <w:r>
             <w:rPr>
-              <w:b/>
-              <w:bCs/>
-              <w:color w:val="EE0000"/>
+              <w:color w:val="000000" w:themeColor="text1"/>
             </w:rPr>
             <w:t>Empreendimento</w:t>
           </w:r>
@@ -344,9 +316,7 @@
       <w:sdt>
         <w:sdtPr>
           <w:rPr>
-            <w:b/>
-            <w:bCs/>
-            <w:color w:val="EE0000"/>
+            <w:color w:val="000000" w:themeColor="text1"/>
           </w:rPr>
           <w:alias w:val="Valor do negócio"/>
           <w:id w:val="203841096"/>
@@ -358,17 +328,13 @@
         <w:sdtContent>
           <w:r>
             <w:rPr>
-              <w:b/>
-              <w:bCs/>
-              <w:color w:val="EE0000"/>
+              <w:color w:val="000000" w:themeColor="text1"/>
             </w:rPr>
             <w:t>V</w:t>
           </w:r>
           <w:r>
             <w:rPr>
-              <w:b/>
-              <w:bCs/>
-              <w:color w:val="EE0000"/>
+              <w:color w:val="000000" w:themeColor="text1"/>
             </w:rPr>
             <w:t>alor do negócio</w:t>
           </w:r>
@@ -635,9 +601,7 @@
         <w:sdtPr>
           <w:rPr>
             <w:rFonts w:ascii="Calibri" w:eastAsia="Times New Roman" w:hAnsi="Calibri" w:cs="Calibri"/>
-            <w:b/>
-            <w:bCs/>
-            <w:color w:val="EE0000"/>
+            <w:color w:val="000000" w:themeColor="text1"/>
             <w:sz w:val="20"/>
             <w:szCs w:val="20"/>
             <w:lang w:eastAsia="pt-BR"/>
@@ -652,9 +616,7 @@
             <w:sdtPr>
               <w:rPr>
                 <w:rFonts w:ascii="Calibri" w:eastAsia="Times New Roman" w:hAnsi="Calibri" w:cs="Calibri"/>
-                <w:b/>
-                <w:bCs/>
-                <w:color w:val="EE0000"/>
+                <w:color w:val="000000" w:themeColor="text1"/>
                 <w:sz w:val="20"/>
                 <w:szCs w:val="20"/>
                 <w:lang w:eastAsia="pt-BR"/>
@@ -687,9 +649,7 @@
                       <w:jc w:val="center"/>
                       <w:rPr>
                         <w:rFonts w:ascii="Calibri" w:eastAsia="Times New Roman" w:hAnsi="Calibri" w:cs="Calibri"/>
-                        <w:b/>
-                        <w:bCs/>
-                        <w:color w:val="EE0000"/>
+                        <w:color w:val="000000" w:themeColor="text1"/>
                         <w:sz w:val="20"/>
                         <w:szCs w:val="20"/>
                         <w:lang w:eastAsia="pt-BR"/>
@@ -699,9 +659,7 @@
                       <w:sdtPr>
                         <w:rPr>
                           <w:rFonts w:ascii="Calibri" w:eastAsia="Times New Roman" w:hAnsi="Calibri" w:cs="Calibri"/>
-                          <w:b/>
-                          <w:bCs/>
-                          <w:color w:val="EE0000"/>
+                          <w:color w:val="000000" w:themeColor="text1"/>
                           <w:sz w:val="20"/>
                           <w:szCs w:val="20"/>
                           <w:lang w:eastAsia="pt-BR"/>
@@ -718,9 +676,7 @@
                         <w:r>
                           <w:rPr>
                             <w:rFonts w:ascii="Calibri" w:eastAsia="Times New Roman" w:hAnsi="Calibri" w:cs="Calibri"/>
-                            <w:b/>
-                            <w:bCs/>
-                            <w:color w:val="EE0000"/>
+                            <w:color w:val="000000" w:themeColor="text1"/>
                             <w:sz w:val="20"/>
                             <w:szCs w:val="20"/>
                             <w:lang w:eastAsia="pt-BR"/>
@@ -732,9 +688,7 @@
                     <w:r>
                       <w:rPr>
                         <w:rFonts w:ascii="Calibri" w:eastAsia="Times New Roman" w:hAnsi="Calibri" w:cs="Calibri"/>
-                        <w:b/>
-                        <w:bCs/>
-                        <w:color w:val="EE0000"/>
+                        <w:color w:val="000000" w:themeColor="text1"/>
                         <w:sz w:val="20"/>
                         <w:szCs w:val="20"/>
                         <w:lang w:eastAsia="pt-BR"/>
@@ -747,9 +701,7 @@
                   <w:sdtPr>
                     <w:rPr>
                       <w:rFonts w:ascii="Calibri" w:eastAsia="Times New Roman" w:hAnsi="Calibri" w:cs="Calibri"/>
-                      <w:b/>
-                      <w:bCs/>
-                      <w:color w:val="EE0000"/>
+                      <w:color w:val="000000" w:themeColor="text1"/>
                       <w:sz w:val="20"/>
                       <w:szCs w:val="20"/>
                       <w:lang w:eastAsia="pt-BR"/>
@@ -780,9 +732,7 @@
                           <w:jc w:val="center"/>
                           <w:rPr>
                             <w:rFonts w:ascii="Calibri" w:eastAsia="Times New Roman" w:hAnsi="Calibri" w:cs="Calibri"/>
-                            <w:b/>
-                            <w:bCs/>
-                            <w:color w:val="EE0000"/>
+                            <w:color w:val="000000" w:themeColor="text1"/>
                             <w:sz w:val="20"/>
                             <w:szCs w:val="20"/>
                             <w:lang w:eastAsia="pt-BR"/>
@@ -791,9 +741,7 @@
                         <w:r>
                           <w:rPr>
                             <w:rFonts w:ascii="Calibri" w:eastAsia="Times New Roman" w:hAnsi="Calibri" w:cs="Calibri"/>
-                            <w:b/>
-                            <w:bCs/>
-                            <w:color w:val="EE0000"/>
+                            <w:color w:val="000000" w:themeColor="text1"/>
                             <w:sz w:val="20"/>
                             <w:szCs w:val="20"/>
                             <w:lang w:eastAsia="pt-BR"/>
@@ -808,9 +756,7 @@
                   <w:sdtPr>
                     <w:rPr>
                       <w:rFonts w:ascii="Calibri" w:eastAsia="Times New Roman" w:hAnsi="Calibri" w:cs="Calibri"/>
-                      <w:b/>
-                      <w:bCs/>
-                      <w:color w:val="EE0000"/>
+                      <w:color w:val="000000" w:themeColor="text1"/>
                       <w:sz w:val="20"/>
                       <w:szCs w:val="20"/>
                       <w:lang w:eastAsia="pt-BR"/>
@@ -840,9 +786,7 @@
                           <w:jc w:val="center"/>
                           <w:rPr>
                             <w:rFonts w:ascii="Calibri" w:eastAsia="Times New Roman" w:hAnsi="Calibri" w:cs="Calibri"/>
-                            <w:b/>
-                            <w:bCs/>
-                            <w:color w:val="EE0000"/>
+                            <w:color w:val="000000" w:themeColor="text1"/>
                             <w:sz w:val="20"/>
                             <w:szCs w:val="20"/>
                             <w:lang w:eastAsia="pt-BR"/>
@@ -851,9 +795,7 @@
                         <w:r>
                           <w:rPr>
                             <w:rFonts w:ascii="Calibri" w:eastAsia="Times New Roman" w:hAnsi="Calibri" w:cs="Calibri"/>
-                            <w:b/>
-                            <w:bCs/>
-                            <w:color w:val="EE0000"/>
+                            <w:color w:val="000000" w:themeColor="text1"/>
                             <w:sz w:val="20"/>
                             <w:szCs w:val="20"/>
                             <w:lang w:eastAsia="pt-BR"/>
@@ -868,9 +810,7 @@
                   <w:sdtPr>
                     <w:rPr>
                       <w:rFonts w:ascii="Calibri" w:eastAsia="Times New Roman" w:hAnsi="Calibri" w:cs="Calibri"/>
-                      <w:b/>
-                      <w:bCs/>
-                      <w:color w:val="EE0000"/>
+                      <w:color w:val="000000" w:themeColor="text1"/>
                       <w:sz w:val="20"/>
                       <w:szCs w:val="20"/>
                       <w:lang w:eastAsia="pt-BR"/>
@@ -901,9 +841,7 @@
                           <w:jc w:val="center"/>
                           <w:rPr>
                             <w:rFonts w:ascii="Calibri" w:eastAsia="Times New Roman" w:hAnsi="Calibri" w:cs="Calibri"/>
-                            <w:b/>
-                            <w:bCs/>
-                            <w:color w:val="EE0000"/>
+                            <w:color w:val="000000" w:themeColor="text1"/>
                             <w:sz w:val="20"/>
                             <w:szCs w:val="20"/>
                             <w:lang w:eastAsia="pt-BR"/>
@@ -912,9 +850,7 @@
                         <w:r>
                           <w:rPr>
                             <w:rFonts w:ascii="Calibri" w:eastAsia="Times New Roman" w:hAnsi="Calibri" w:cs="Calibri"/>
-                            <w:b/>
-                            <w:bCs/>
-                            <w:color w:val="EE0000"/>
+                            <w:color w:val="000000" w:themeColor="text1"/>
                             <w:sz w:val="20"/>
                             <w:szCs w:val="20"/>
                             <w:lang w:eastAsia="pt-BR"/>
@@ -964,19 +900,11 @@
       <w:r>
         <w:t xml:space="preserve"> no montante total de </w:t>
       </w:r>
-      <w:r>
-        <w:t>R$</w:t>
-      </w:r>
-      <w:r>
-        <w:t xml:space="preserve"> </w:t>
-      </w:r>
       <w:sdt>
         <w:sdtPr>
           <w:rPr>
             <w:rFonts w:ascii="Calibri" w:eastAsia="Times New Roman" w:hAnsi="Calibri" w:cs="Calibri"/>
-            <w:b/>
-            <w:bCs/>
-            <w:color w:val="EE0000"/>
+            <w:color w:val="000000" w:themeColor="text1"/>
             <w:lang w:eastAsia="pt-BR"/>
           </w:rPr>
           <w:alias w:val="Montante total devido"/>
@@ -991,9 +919,7 @@
           <w:r>
             <w:rPr>
               <w:rFonts w:ascii="Calibri" w:eastAsia="Times New Roman" w:hAnsi="Calibri" w:cs="Calibri"/>
-              <w:b/>
-              <w:bCs/>
-              <w:color w:val="EE0000"/>
+              <w:color w:val="000000" w:themeColor="text1"/>
               <w:lang w:eastAsia="pt-BR"/>
             </w:rPr>
             <w:t>Montante total devido</w:t>
@@ -2020,8 +1946,8 @@
     <w:rsid w:val="0008618A"/>
     <w:rsid w:val="000A208B"/>
     <w:rsid w:val="000A5149"/>
+    <w:rsid w:val="00132452"/>
     <w:rsid w:val="001704CA"/>
-    <w:rsid w:val="001D759B"/>
     <w:rsid w:val="00212990"/>
     <w:rsid w:val="002C6DD6"/>
     <w:rsid w:val="00335F43"/>

</xml_diff>